<commit_message>
docs: Rename report to Block diagram report and synchronize arithmetic unit implementation specifications
</commit_message>
<xml_diff>
--- a/Project Abstract.docx
+++ b/Project Abstract.docx
@@ -742,7 +742,7 @@
         <w:rPr>
           <w:rtl w:val="0"/>
         </w:rPr>
-        <w:t>•  Latency (cycles): 1 clock cycle for standard integer instructions and L1 cache hits. 10 clock cycles simulated for main memory access (cache miss penalty) to realistically model real-world DRAM latency. 2–4 cycles for FPU ops (FADD.S/FSUB.S/FMUL.S); ~10–16 cycles for FDIV.S. Multi-cycle stall for hardware divider. 1-cycle load-use stall; 2-cycle branch-misprediction flush.</w:t>
+        <w:t>•  Latency (cycles): 1 clock cycle for standard integer instructions, single-cycle MUL (DSP slices), and L1 cache hits. Floating-point latencies: 4 clock cycles for FMUL.S (DSP mantissa multiplication), 5 clock cycles for FADD.S and FSUB.S (standard logic FSM, no DSPs), and 15 clock cycles for FDIV.S (Newton-Raphson algorithm with DSP iterative multiplication and BRAM lookup). 32 clock cycles for integer DIV (shift-and-subtract state machine using standard logic, no DSPs). 10 clock cycles simulated for main memory access (cache miss penalty). 1-cycle load-use stall; 2-cycle branch-misprediction flush.</w:t>
       </w:r>
     </w:p>
     <w:p>
@@ -782,7 +782,7 @@
         <w:rPr>
           <w:rtl w:val="0"/>
         </w:rPr>
-        <w:t>•  Resource usage: LUTs ≤ 5,000 for core + hazard logic + FPU + divider. BRAM ≤ 16 tiles for L1 I-Cache, L1 D-Cache, and main instruction/data memory. DSP Slices ≤ 6 for the DSP-block-based hardware multiplier and FPU datapath (using native FPGA DSP48E1 primitives for maximum speed and minimal LUT overhead).</w:t>
+        <w:t>•  Resource usage: LUTs ≤ 5,000 for core + hazard logic + standard logic FPU (FADD.S/FSUB.S) + divider. BRAM ≤ 16 tiles for L1 I-Cache, L1 D-Cache, FDIV.S initial guess lookup table, and main memory. DSP Slices ≤ 6 for the hardware multiplier (MUL) and FPU datapath (FMUL.S mantissa multiply and FDIV.S Newton-Raphson iterations, utilizing native Artix-7 DSP48E1 primitives).</w:t>
       </w:r>
     </w:p>
     <w:p>
@@ -853,7 +853,7 @@
         <w:rPr>
           <w:rtl w:val="0"/>
         </w:rPr>
-        <w:t>•  New modules: Dedicated Verilog modules for pipeline registers (IF/ID, ID/EX, EX/MEM, MEM/WB), Hazard Detection &amp; Forwarding Unit, direct-mapped L1 I-Cache and L1 D-Cache with a 10-cycle simulated main-memory latency model, dual-engine Hardware Multiplier (native Artix-7 DSP48E1 slice instantiation and Radix-4 Modified Booth Multiplier RTL), multi-cycle Hardware Divider, IEEE 754 FPU (FADD.S, FSUB.S, FMUL.S, FDIV.S), BTB Branch Predictor, and passive CSR performance counters (cycle, instret, cache hit/miss).</w:t>
+        <w:t>•  New modules: Dedicated Verilog modules for pipeline registers (IF/ID, ID/EX, EX/MEM, MEM/WB), Hazard Detection &amp; Forwarding Unit, direct-mapped L1 I-Cache and L1 D-Cache with a 10-cycle simulated main-memory latency model, dual-engine Hardware Multiplier (1-cycle native Artix-7 DSP48E1 slice instantiation and Radix-4 Booth logic), 32-cycle shift-and-subtract Hardware Divider (standard logic, no DSPs), IEEE 754 FPU (5-cycle FADD.S/FSUB.S via standard logic; 4-cycle FMUL.S via DSP; 15-cycle FDIV.S via Newton-Raphson using DSP iterative multiplication and BRAM lookup), BTB Branch Predictor, and passive CSR performance counters.</w:t>
       </w:r>
     </w:p>
     <w:p>

</xml_diff>

<commit_message>
docs: Reorder team members across abstract and block diagram report
</commit_message>
<xml_diff>
--- a/Project Abstract.docx
+++ b/Project Abstract.docx
@@ -2065,7 +2065,7 @@
               <w:rPr>
                 <w:rtl w:val="0"/>
               </w:rPr>
-              <w:t>Sigilipelli Praneeth Sai Bharath</w:t>
+              <w:t>Bandaru Rohith Datta</w:t>
             </w:r>
           </w:p>
         </w:tc>
@@ -2095,7 +2095,7 @@
               <w:rPr>
                 <w:rtl w:val="0"/>
               </w:rPr>
-              <w:t>5-Stage Pipeline (Hazard Detection Unit lead) + Static Branch Prediction (32-entry BTB) + Integration</w:t>
+              <w:t>5-Stage Pipeline (Control Unit lead) + L1 D-Cache + Performance Counter CSRs + Zbb Extension + Integration</w:t>
             </w:r>
           </w:p>
         </w:tc>
@@ -2133,7 +2133,7 @@
               <w:rPr>
                 <w:rtl w:val="0"/>
               </w:rPr>
-              <w:t>Bandaru Rohith Datta</w:t>
+              <w:t>Sigilipelli Praneeth Sai Bharath</w:t>
             </w:r>
           </w:p>
         </w:tc>
@@ -2163,7 +2163,7 @@
               <w:rPr>
                 <w:rtl w:val="0"/>
               </w:rPr>
-              <w:t>5-Stage Pipeline (Control Unit lead) + L1 D-Cache + Performance Counter CSRs + Zbb Extension + Integration</w:t>
+              <w:t>5-Stage Pipeline (Hazard Detection Unit lead) + Static Branch Prediction (32-entry BTB) + Integration</w:t>
             </w:r>
           </w:p>
         </w:tc>

</xml_diff>